<commit_message>
Deployed a947af1 with MkDocs version: 1.6.1
</commit_message>
<xml_diff>
--- a/Eurorack/308-Voltage-Controlled-Filter-And-Wavefolder/Files/308-Rev.1.docx
+++ b/Eurorack/308-Voltage-Controlled-Filter-And-Wavefolder/Files/308-Rev.1.docx
@@ -1461,14 +1461,7 @@
           <w:rFonts w:ascii="Times New Roman" w:hAnsi="Times New Roman" w:cs="Times New Roman"/>
           <w:lang w:val="en-US"/>
         </w:rPr>
-        <w:t xml:space="preserve"> </w:t>
-      </w:r>
-      <w:r>
-        <w:rPr>
-          <w:rFonts w:ascii="Times New Roman" w:hAnsi="Times New Roman" w:cs="Times New Roman"/>
-          <w:lang w:val="en-US"/>
-        </w:rPr>
-        <w:t>(see fig. 3.2)</w:t>
+        <w:t xml:space="preserve"> (see fig. 3.2)</w:t>
       </w:r>
       <w:r>
         <w:rPr>
@@ -1706,14 +1699,7 @@
           <w:rFonts w:ascii="Times New Roman" w:hAnsi="Times New Roman" w:cs="Times New Roman"/>
           <w:lang w:val="en-US"/>
         </w:rPr>
-        <w:t>mode adds a third wavefolding section</w:t>
-      </w:r>
-      <w:r>
-        <w:rPr>
-          <w:rFonts w:ascii="Times New Roman" w:hAnsi="Times New Roman" w:cs="Times New Roman"/>
-          <w:lang w:val="en-US"/>
-        </w:rPr>
-        <w:t xml:space="preserve">. </w:t>
+        <w:t xml:space="preserve">mode adds a third wavefolding section. </w:t>
       </w:r>
       <w:r>
         <w:rPr>
@@ -1766,21 +1752,7 @@
           <w:rFonts w:ascii="Times New Roman" w:hAnsi="Times New Roman" w:cs="Times New Roman"/>
           <w:lang w:val="en-US"/>
         </w:rPr>
-        <w:t xml:space="preserve">increase the wavefolder depth of stage one and two of the wavefolder, respectively. They also lead to clipping and distortion. There are eight </w:t>
-      </w:r>
-      <w:r>
-        <w:rPr>
-          <w:rFonts w:ascii="Times New Roman" w:hAnsi="Times New Roman" w:cs="Times New Roman"/>
-          <w:lang w:val="en-US"/>
-        </w:rPr>
-        <w:t>possible</w:t>
-      </w:r>
-      <w:r>
-        <w:rPr>
-          <w:rFonts w:ascii="Times New Roman" w:hAnsi="Times New Roman" w:cs="Times New Roman"/>
-          <w:lang w:val="en-US"/>
-        </w:rPr>
-        <w:t xml:space="preserve"> combinations of these three switches, and all of them drastically change the quality of the wavefolder.</w:t>
+        <w:t>increase the wavefolder depth of stage one and two of the wavefolder, respectively. They also lead to clipping and distortion. There are eight possible combinations of these three switches, and all of them drastically change the quality of the wavefolder.</w:t>
       </w:r>
     </w:p>
     <w:p>
@@ -1858,7 +1830,7 @@
       <w:pPr>
         <w:spacing w:line="360" w:lineRule="auto"/>
         <w:rPr>
-          <w:rFonts w:ascii="Times New Roman" w:hAnsi="Times New Roman" w:cs="Times New Roman" w:hint="eastAsia"/>
+          <w:rFonts w:ascii="Times New Roman" w:hAnsi="Times New Roman" w:cs="Times New Roman"/>
           <w:lang w:val="en-US"/>
         </w:rPr>
       </w:pPr>
@@ -1963,6 +1935,16 @@
           <w:lang w:val="en-US"/>
         </w:rPr>
       </w:pPr>
+      <w:r>
+        <w:rPr>
+          <w:rFonts w:ascii="Times New Roman" w:hAnsi="Times New Roman" w:cs="Times New Roman"/>
+          <w:b/>
+          <w:bCs/>
+          <w:u w:val="single"/>
+          <w:lang w:val="en-US"/>
+        </w:rPr>
+        <w:t xml:space="preserve">  </w:t>
+      </w:r>
     </w:p>
     <w:p>
       <w:pPr>
@@ -2904,16 +2886,7 @@
                 <w:iCs/>
                 <w:lang w:val="en-US"/>
               </w:rPr>
-              <w:t>Any modular levels, atten</w:t>
-            </w:r>
-            <w:r>
-              <w:rPr>
-                <w:rFonts w:ascii="Times New Roman" w:hAnsi="Times New Roman" w:cs="Times New Roman"/>
-                <w:i/>
-                <w:iCs/>
-                <w:lang w:val="en-US"/>
-              </w:rPr>
-              <w:t>uated</w:t>
+              <w:t>Any modular levels, attenuated</w:t>
             </w:r>
           </w:p>
         </w:tc>

</xml_diff>